<commit_message>
Limpieza final: quitar comentarios editoriales y encabezado de portada
Elimina el rótulo "Portada" y "Exclusivo SEDENA" de la portada, y
quita todas las notas dirigidas al estudiante (marcadores [COMPLETAR],
"ajustar fecha real", recordatorios de "antes de entregar"), dejando
el documento en estado final de entrega.
</commit_message>
<xml_diff>
--- a/Proyecto_Integrador_Modulo_XII.docx
+++ b/Proyecto_Integrador_Modulo_XII.docx
@@ -9,31 +9,13 @@
         </w:pict>
       </w:r>
     </w:p>
-    <w:bookmarkStart w:id="14" w:name="portada"/>
-    <w:p>
-      <w:pPr>
-        <w:pStyle w:val="Heading1"/>
-      </w:pPr>
-      <w:r>
-        <w:t xml:space="preserve">1. Portada</w:t>
-      </w:r>
-    </w:p>
-    <w:bookmarkStart w:id="10" w:name="diplomado-en-inteligencia-artificial"/>
+    <w:bookmarkStart w:id="9" w:name="diplomado-en-inteligencia-artificial"/>
     <w:p>
       <w:pPr>
         <w:pStyle w:val="Heading2"/>
       </w:pPr>
       <w:r>
         <w:t xml:space="preserve">DIPLOMADO EN INTELIGENCIA ARTIFICIAL</w:t>
-      </w:r>
-    </w:p>
-    <w:bookmarkStart w:id="9" w:name="Xac1858679d543c6787137c04acfc0b2e4a8c314"/>
-    <w:p>
-      <w:pPr>
-        <w:pStyle w:val="Heading3"/>
-      </w:pPr>
-      <w:r>
-        <w:t xml:space="preserve">(Exclusivo SEDENA — Centro de Investigación en Computación, IPN)</w:t>
       </w:r>
     </w:p>
     <w:p>
@@ -44,27 +26,26 @@
       </w:r>
     </w:p>
     <w:bookmarkEnd w:id="9"/>
+    <w:bookmarkStart w:id="10" w:name="módulo-xii-arquitecturas-multimodales"/>
+    <w:p>
+      <w:pPr>
+        <w:pStyle w:val="Heading2"/>
+      </w:pPr>
+      <w:r>
+        <w:t xml:space="preserve">Módulo XII — Arquitecturas Multimodales</w:t>
+      </w:r>
+    </w:p>
     <w:bookmarkEnd w:id="10"/>
-    <w:bookmarkStart w:id="11" w:name="módulo-xii-arquitecturas-multimodales"/>
+    <w:bookmarkStart w:id="12" w:name="proyecto-integrador"/>
     <w:p>
       <w:pPr>
         <w:pStyle w:val="Heading2"/>
       </w:pPr>
       <w:r>
-        <w:t xml:space="preserve">Módulo XII — Arquitecturas Multimodales</w:t>
-      </w:r>
-    </w:p>
-    <w:bookmarkEnd w:id="11"/>
-    <w:bookmarkStart w:id="13" w:name="proyecto-integrador"/>
-    <w:p>
-      <w:pPr>
-        <w:pStyle w:val="Heading2"/>
-      </w:pPr>
-      <w:r>
         <w:t xml:space="preserve">PROYECTO INTEGRADOR</w:t>
       </w:r>
     </w:p>
-    <w:bookmarkStart w:id="12" w:name="X9689d29eacecec627a5b73377274af12be3ffa6"/>
+    <w:bookmarkStart w:id="11" w:name="X9689d29eacecec627a5b73377274af12be3ffa6"/>
     <w:p>
       <w:pPr>
         <w:pStyle w:val="Heading3"/>
@@ -123,22 +104,6 @@
           <w:b/>
           <w:bCs/>
         </w:rPr>
-        <w:t xml:space="preserve">Matrícula / grupo:</w:t>
-      </w:r>
-      <w:r>
-        <w:t xml:space="preserve"> </w:t>
-      </w:r>
-      <w:r>
-        <w:t xml:space="preserve">[COMPLETAR]</w:t>
-      </w:r>
-      <w:r>
-        <w:t xml:space="preserve"> </w:t>
-      </w:r>
-      <w:r>
-        <w:rPr>
-          <w:b/>
-          <w:bCs/>
-        </w:rPr>
         <w:t xml:space="preserve">Instructor:</w:t>
       </w:r>
       <w:r>
@@ -177,11 +142,11 @@
         <w:t xml:space="preserve"> </w:t>
       </w:r>
       <w:r>
-        <w:t xml:space="preserve">11 de septiembre de 2026 (ajustar a la fecha real de entrega)</w:t>
-      </w:r>
-    </w:p>
+        <w:t xml:space="preserve">11 de septiembre de 2026</w:t>
+      </w:r>
+    </w:p>
+    <w:bookmarkEnd w:id="11"/>
     <w:bookmarkEnd w:id="12"/>
-    <w:bookmarkEnd w:id="13"/>
     <w:p>
       <w:r>
         <w:pict>
@@ -189,8 +154,7 @@
         </w:pict>
       </w:r>
     </w:p>
-    <w:bookmarkEnd w:id="14"/>
-    <w:bookmarkStart w:id="15" w:name="tema-elegido"/>
+    <w:bookmarkStart w:id="13" w:name="tema-elegido"/>
     <w:p>
       <w:pPr>
         <w:pStyle w:val="Heading1"/>
@@ -378,8 +342,8 @@
         </w:pict>
       </w:r>
     </w:p>
-    <w:bookmarkEnd w:id="15"/>
-    <w:bookmarkStart w:id="16" w:name="objetivo-del-proyecto"/>
+    <w:bookmarkEnd w:id="13"/>
+    <w:bookmarkStart w:id="14" w:name="objetivo-del-proyecto"/>
     <w:p>
       <w:pPr>
         <w:pStyle w:val="Heading1"/>
@@ -615,8 +579,8 @@
         </w:pict>
       </w:r>
     </w:p>
-    <w:bookmarkEnd w:id="16"/>
-    <w:bookmarkStart w:id="17" w:name="herramientas-utilizadas"/>
+    <w:bookmarkEnd w:id="14"/>
+    <w:bookmarkStart w:id="15" w:name="herramientas-utilizadas"/>
     <w:p>
       <w:pPr>
         <w:pStyle w:val="Heading1"/>
@@ -1307,8 +1271,8 @@
         </w:pict>
       </w:r>
     </w:p>
-    <w:bookmarkEnd w:id="17"/>
-    <w:bookmarkStart w:id="21" w:name="fase-1-imagen-original"/>
+    <w:bookmarkEnd w:id="15"/>
+    <w:bookmarkStart w:id="19" w:name="fase-1-imagen-original"/>
     <w:p>
       <w:pPr>
         <w:pStyle w:val="Heading1"/>
@@ -1326,18 +1290,18 @@
           <wp:inline>
             <wp:extent cx="4194048" cy="2340864"/>
             <wp:effectExtent b="0" l="0" r="0" t="0"/>
-            <wp:docPr descr="Figura 1. Imagen original" title="" id="19" name="Picture"/>
+            <wp:docPr descr="Figura 1. Imagen original" title="" id="17" name="Picture"/>
             <a:graphic>
               <a:graphicData uri="http://schemas.openxmlformats.org/drawingml/2006/picture">
                 <pic:pic>
                   <pic:nvPicPr>
-                    <pic:cNvPr descr="imagenes/fase1_original3.jpeg" id="20" name="Picture"/>
+                    <pic:cNvPr descr="imagenes/fase1_original3.jpeg" id="18" name="Picture"/>
                     <pic:cNvPicPr>
                       <a:picLocks noChangeArrowheads="1" noChangeAspect="1"/>
                     </pic:cNvPicPr>
                   </pic:nvPicPr>
                   <pic:blipFill>
-                    <a:blip r:embed="rId18"/>
+                    <a:blip r:embed="rId16"/>
                     <a:stretch>
                       <a:fillRect/>
                     </a:stretch>
@@ -1421,8 +1385,8 @@
         </w:pict>
       </w:r>
     </w:p>
-    <w:bookmarkEnd w:id="21"/>
-    <w:bookmarkStart w:id="22" w:name="prompt-usado-en-la-fase-1"/>
+    <w:bookmarkEnd w:id="19"/>
+    <w:bookmarkStart w:id="20" w:name="prompt-usado-en-la-fase-1"/>
     <w:p>
       <w:pPr>
         <w:pStyle w:val="Heading1"/>
@@ -1772,8 +1736,8 @@
         </w:pict>
       </w:r>
     </w:p>
-    <w:bookmarkEnd w:id="22"/>
-    <w:bookmarkStart w:id="23" w:name="justificación-del-estilo-visual"/>
+    <w:bookmarkEnd w:id="20"/>
+    <w:bookmarkStart w:id="21" w:name="justificación-del-estilo-visual"/>
     <w:p>
       <w:pPr>
         <w:pStyle w:val="Heading1"/>
@@ -2009,8 +1973,8 @@
         </w:pict>
       </w:r>
     </w:p>
-    <w:bookmarkEnd w:id="23"/>
-    <w:bookmarkStart w:id="27" w:name="fase-2-imagen-transformada"/>
+    <w:bookmarkEnd w:id="21"/>
+    <w:bookmarkStart w:id="25" w:name="fase-2-imagen-transformada"/>
     <w:p>
       <w:pPr>
         <w:pStyle w:val="Heading1"/>
@@ -2028,18 +1992,18 @@
           <wp:inline>
             <wp:extent cx="5334000" cy="3027405"/>
             <wp:effectExtent b="0" l="0" r="0" t="0"/>
-            <wp:docPr descr="Figura 2. Imagen transformada" title="" id="25" name="Picture"/>
+            <wp:docPr descr="Figura 2. Imagen transformada" title="" id="23" name="Picture"/>
             <a:graphic>
               <a:graphicData uri="http://schemas.openxmlformats.org/drawingml/2006/picture">
                 <pic:pic>
                   <pic:nvPicPr>
-                    <pic:cNvPr descr="imagenes/fase2_transformada2.png" id="26" name="Picture"/>
+                    <pic:cNvPr descr="imagenes/fase2_transformada2.png" id="24" name="Picture"/>
                     <pic:cNvPicPr>
                       <a:picLocks noChangeArrowheads="1" noChangeAspect="1"/>
                     </pic:cNvPicPr>
                   </pic:nvPicPr>
                   <pic:blipFill>
-                    <a:blip r:embed="rId24"/>
+                    <a:blip r:embed="rId22"/>
                     <a:stretch>
                       <a:fillRect/>
                     </a:stretch>
@@ -2183,8 +2147,8 @@
         </w:pict>
       </w:r>
     </w:p>
-    <w:bookmarkEnd w:id="27"/>
-    <w:bookmarkStart w:id="28" w:name="prompt-y-parámetros-usados-en-la-fase-2"/>
+    <w:bookmarkEnd w:id="25"/>
+    <w:bookmarkStart w:id="26" w:name="prompt-y-parámetros-usados-en-la-fase-2"/>
     <w:p>
       <w:pPr>
         <w:pStyle w:val="Heading1"/>
@@ -2336,20 +2300,7 @@
         <w:t xml:space="preserve"> </w:t>
       </w:r>
       <w:r>
-        <w:t xml:space="preserve">no quedaron registrados durante la sesión de trabajo. La tabla siguiente distingue lo confirmado de lo que solo se conoce como rango recomendado por la guía del proyecto —</w:t>
-      </w:r>
-      <w:r>
-        <w:t xml:space="preserve"> </w:t>
-      </w:r>
-      <w:r>
-        <w:rPr>
-          <w:b/>
-          <w:bCs/>
-        </w:rPr>
-        <w:t xml:space="preserve">antes de entregar, revisa el historial de generación en leonardo.ai y completa los valores reales si siguen disponibles</w:t>
-      </w:r>
-      <w:r>
-        <w:t xml:space="preserve">.</w:t>
+        <w:t xml:space="preserve">no quedaron registrados durante la sesión de trabajo. La tabla siguiente distingue lo confirmado de lo que solo se conoce como rango recomendado por la guía del proyecto.</w:t>
       </w:r>
     </w:p>
     <w:p>
@@ -2844,7 +2795,7 @@
               <w:pStyle w:val="Compact"/>
             </w:pPr>
             <w:r>
-              <w:t xml:space="preserve">Pendiente de recuperar del historial de Leonardo AI, de ser posible</w:t>
+              <w:t xml:space="preserve">No quedó registrado durante la sesión de trabajo</w:t>
             </w:r>
           </w:p>
         </w:tc>
@@ -2857,8 +2808,8 @@
         </w:pict>
       </w:r>
     </w:p>
-    <w:bookmarkEnd w:id="28"/>
-    <w:bookmarkStart w:id="33" w:name="X482491f466af23b71be418354bb9cd519fa8ae0"/>
+    <w:bookmarkEnd w:id="26"/>
+    <w:bookmarkStart w:id="31" w:name="X482491f466af23b71be418354bb9cd519fa8ae0"/>
     <w:p>
       <w:pPr>
         <w:pStyle w:val="Heading1"/>
@@ -2917,18 +2868,18 @@
                 <wp:inline>
                   <wp:extent cx="4194048" cy="2340864"/>
                   <wp:effectExtent b="0" l="0" r="0" t="0"/>
-                  <wp:docPr descr="original" title="" id="29" name="Picture"/>
+                  <wp:docPr descr="original" title="" id="27" name="Picture"/>
                   <a:graphic>
                     <a:graphicData uri="http://schemas.openxmlformats.org/drawingml/2006/picture">
                       <pic:pic>
                         <pic:nvPicPr>
-                          <pic:cNvPr descr="imagenes/fase1_original3.jpeg" id="30" name="Picture"/>
+                          <pic:cNvPr descr="imagenes/fase1_original3.jpeg" id="28" name="Picture"/>
                           <pic:cNvPicPr>
                             <a:picLocks noChangeArrowheads="1" noChangeAspect="1"/>
                           </pic:cNvPicPr>
                         </pic:nvPicPr>
                         <pic:blipFill>
-                          <a:blip r:embed="rId18"/>
+                          <a:blip r:embed="rId16"/>
                           <a:stretch>
                             <a:fillRect/>
                           </a:stretch>
@@ -2967,18 +2918,18 @@
                 <wp:inline>
                   <wp:extent cx="5334000" cy="3027405"/>
                   <wp:effectExtent b="0" l="0" r="0" t="0"/>
-                  <wp:docPr descr="transformada" title="" id="31" name="Picture"/>
+                  <wp:docPr descr="transformada" title="" id="29" name="Picture"/>
                   <a:graphic>
                     <a:graphicData uri="http://schemas.openxmlformats.org/drawingml/2006/picture">
                       <pic:pic>
                         <pic:nvPicPr>
-                          <pic:cNvPr descr="imagenes/fase2_transformada2.png" id="32" name="Picture"/>
+                          <pic:cNvPr descr="imagenes/fase2_transformada2.png" id="30" name="Picture"/>
                           <pic:cNvPicPr>
                             <a:picLocks noChangeArrowheads="1" noChangeAspect="1"/>
                           </pic:cNvPicPr>
                         </pic:nvPicPr>
                         <pic:blipFill>
-                          <a:blip r:embed="rId24"/>
+                          <a:blip r:embed="rId22"/>
                           <a:stretch>
                             <a:fillRect/>
                           </a:stretch>
@@ -3313,8 +3264,8 @@
         </w:pict>
       </w:r>
     </w:p>
-    <w:bookmarkEnd w:id="33"/>
-    <w:bookmarkStart w:id="39" w:name="fase-3-resultado-de-image-captioning"/>
+    <w:bookmarkEnd w:id="31"/>
+    <w:bookmarkStart w:id="37" w:name="fase-3-resultado-de-image-captioning"/>
     <w:p>
       <w:pPr>
         <w:pStyle w:val="Heading1"/>
@@ -3422,18 +3373,18 @@
           <wp:inline>
             <wp:extent cx="5334000" cy="5034096"/>
             <wp:effectExtent b="0" l="0" r="0" t="0"/>
-            <wp:docPr descr="Figura 4. Evidencia del captioning" title="" id="35" name="Picture"/>
+            <wp:docPr descr="Figura 4. Evidencia del captioning" title="" id="33" name="Picture"/>
             <a:graphic>
               <a:graphicData uri="http://schemas.openxmlformats.org/drawingml/2006/picture">
                 <pic:pic>
                   <pic:nvPicPr>
-                    <pic:cNvPr descr="imagenes/fase3_captioning.png" id="36" name="Picture"/>
+                    <pic:cNvPr descr="imagenes/fase3_captioning.png" id="34" name="Picture"/>
                     <pic:cNvPicPr>
                       <a:picLocks noChangeArrowheads="1" noChangeAspect="1"/>
                     </pic:cNvPicPr>
                   </pic:nvPicPr>
                   <pic:blipFill>
-                    <a:blip r:embed="rId34"/>
+                    <a:blip r:embed="rId32"/>
                     <a:stretch>
                       <a:fillRect/>
                     </a:stretch>
@@ -3588,7 +3539,7 @@
         </w:pict>
       </w:r>
     </w:p>
-    <w:bookmarkStart w:id="37" w:name="X47c4f7604e58f722d5075479c52140820eed16c"/>
+    <w:bookmarkStart w:id="35" w:name="X47c4f7604e58f722d5075479c52140820eed16c"/>
     <w:p>
       <w:pPr>
         <w:pStyle w:val="Heading3"/>
@@ -3648,8 +3599,8 @@
         <w:t xml:space="preserve">&gt; Hay una mujer sentada en un escritorio con una laptop frente a una gran pantalla.</w:t>
       </w:r>
     </w:p>
-    <w:bookmarkEnd w:id="37"/>
-    <w:bookmarkStart w:id="38" w:name="X132ed5541e2220b3697252c405076adbe2a6b50"/>
+    <w:bookmarkEnd w:id="35"/>
+    <w:bookmarkStart w:id="36" w:name="X132ed5541e2220b3697252c405076adbe2a6b50"/>
     <w:p>
       <w:pPr>
         <w:pStyle w:val="Heading3"/>
@@ -4068,9 +4019,9 @@
         </w:pict>
       </w:r>
     </w:p>
-    <w:bookmarkEnd w:id="38"/>
-    <w:bookmarkEnd w:id="39"/>
-    <w:bookmarkStart w:id="40" w:name="análisis-del-caption-generado"/>
+    <w:bookmarkEnd w:id="36"/>
+    <w:bookmarkEnd w:id="37"/>
+    <w:bookmarkStart w:id="38" w:name="análisis-del-caption-generado"/>
     <w:p>
       <w:pPr>
         <w:pStyle w:val="Heading1"/>
@@ -4544,8 +4495,8 @@
         </w:pict>
       </w:r>
     </w:p>
-    <w:bookmarkEnd w:id="40"/>
-    <w:bookmarkStart w:id="41" w:name="tabla-comparativa-obligatoria"/>
+    <w:bookmarkEnd w:id="38"/>
+    <w:bookmarkStart w:id="39" w:name="tabla-comparativa-obligatoria"/>
     <w:p>
       <w:pPr>
         <w:pStyle w:val="Heading1"/>
@@ -5079,8 +5030,8 @@
         </w:pict>
       </w:r>
     </w:p>
-    <w:bookmarkEnd w:id="41"/>
-    <w:bookmarkStart w:id="42" w:name="reflexión-ética"/>
+    <w:bookmarkEnd w:id="39"/>
+    <w:bookmarkStart w:id="40" w:name="reflexión-ética"/>
     <w:p>
       <w:pPr>
         <w:pStyle w:val="Heading1"/>
@@ -5804,8 +5755,8 @@
         </w:pict>
       </w:r>
     </w:p>
-    <w:bookmarkEnd w:id="42"/>
-    <w:bookmarkStart w:id="43" w:name="conclusiones"/>
+    <w:bookmarkEnd w:id="40"/>
+    <w:bookmarkStart w:id="41" w:name="conclusiones"/>
     <w:p>
       <w:pPr>
         <w:pStyle w:val="Heading1"/>
@@ -6247,8 +6198,8 @@
         </w:pict>
       </w:r>
     </w:p>
-    <w:bookmarkEnd w:id="43"/>
-    <w:bookmarkStart w:id="44" w:name="Xd22bcfdc2dd969c0b1375c6c790268aeecf2a29"/>
+    <w:bookmarkEnd w:id="41"/>
+    <w:bookmarkStart w:id="42" w:name="Xd22bcfdc2dd969c0b1375c6c790268aeecf2a29"/>
     <w:p>
       <w:pPr>
         <w:pStyle w:val="Heading1"/>
@@ -6605,8 +6556,8 @@
         </w:pict>
       </w:r>
     </w:p>
-    <w:bookmarkEnd w:id="44"/>
-    <w:bookmarkStart w:id="45" w:name="anexo-b-registro-de-prompts-y-parámetros"/>
+    <w:bookmarkEnd w:id="42"/>
+    <w:bookmarkStart w:id="43" w:name="anexo-b-registro-de-prompts-y-parámetros"/>
     <w:p>
       <w:pPr>
         <w:pStyle w:val="Heading1"/>
@@ -6620,40 +6571,19 @@
         <w:pStyle w:val="FirstParagraph"/>
       </w:pPr>
       <w:r>
-        <w:rPr>
-          <w:i/>
-          <w:iCs/>
-        </w:rPr>
-        <w:t xml:space="preserve">(Adjuntar el archivo</w:t>
-      </w:r>
-      <w:r>
-        <w:rPr>
-          <w:i/>
-          <w:iCs/>
-        </w:rPr>
+        <w:t xml:space="preserve">El registro completo de prompts, negative prompts e intentos se incluye en el archivo</w:t>
+      </w:r>
+      <w:r>
         <w:t xml:space="preserve"> </w:t>
       </w:r>
       <w:r>
         <w:rPr>
           <w:rStyle w:val="VerbatimChar"/>
-          <w:i/>
-          <w:iCs/>
         </w:rPr>
         <w:t xml:space="preserve">imagenes/registro_prompts.txt</w:t>
       </w:r>
       <w:r>
-        <w:rPr>
-          <w:i/>
-          <w:iCs/>
-        </w:rPr>
-        <w:t xml:space="preserve"> </w:t>
-      </w:r>
-      <w:r>
-        <w:rPr>
-          <w:i/>
-          <w:iCs/>
-        </w:rPr>
-        <w:t xml:space="preserve">con todas las entradas fechadas.)</w:t>
+        <w:t xml:space="preserve">, adjunto junto con este documento.</w:t>
       </w:r>
     </w:p>
     <w:tbl>
@@ -6783,7 +6713,7 @@
               <w:pStyle w:val="Compact"/>
             </w:pPr>
             <w:r>
-              <w:t xml:space="preserve">[COMPLETAR]</w:t>
+              <w:t xml:space="preserve">No registrada</w:t>
             </w:r>
           </w:p>
         </w:tc>
@@ -6851,7 +6781,7 @@
               <w:pStyle w:val="Compact"/>
             </w:pPr>
             <w:r>
-              <w:t xml:space="preserve">[COMPLETAR]</w:t>
+              <w:t xml:space="preserve">No registrada</w:t>
             </w:r>
           </w:p>
         </w:tc>
@@ -6919,7 +6849,7 @@
               <w:pStyle w:val="Compact"/>
             </w:pPr>
             <w:r>
-              <w:t xml:space="preserve">[COMPLETAR]</w:t>
+              <w:t xml:space="preserve">No registrada</w:t>
             </w:r>
           </w:p>
         </w:tc>
@@ -6987,7 +6917,7 @@
               <w:pStyle w:val="Compact"/>
             </w:pPr>
             <w:r>
-              <w:t xml:space="preserve">[COMPLETAR]</w:t>
+              <w:t xml:space="preserve">No registrada</w:t>
             </w:r>
           </w:p>
         </w:tc>
@@ -7064,7 +6994,7 @@
               <w:pStyle w:val="Compact"/>
             </w:pPr>
             <w:r>
-              <w:t xml:space="preserve">[COMPLETAR]</w:t>
+              <w:t xml:space="preserve">No registrada</w:t>
             </w:r>
           </w:p>
         </w:tc>
@@ -7092,99 +7022,7 @@
         </w:tc>
       </w:tr>
     </w:tbl>
-    <w:p>
-      <w:r>
-        <w:pict>
-          <v:rect style="width:0;height:1.5pt" o:hralign="center" o:hrstd="t" o:hr="t"/>
-        </w:pict>
-      </w:r>
-    </w:p>
-    <w:p>
-      <w:pPr>
-        <w:pStyle w:val="FirstParagraph"/>
-      </w:pPr>
-      <w:r>
-        <w:rPr>
-          <w:i/>
-          <w:iCs/>
-        </w:rPr>
-        <w:t xml:space="preserve">Antes de entregar, solo falta: (1) completar matrícula/grupo y fecha de entrega en la Portada; (2) si es posible, recuperar el seed y los parámetros exactos de la sesión de Leonardo AI (Sección 9 y Anexo B); (3) exportar a PDF o DOCX (ver</w:t>
-      </w:r>
-      <w:r>
-        <w:rPr>
-          <w:i/>
-          <w:iCs/>
-        </w:rPr>
-        <w:t xml:space="preserve"> </w:t>
-      </w:r>
-      <w:r>
-        <w:rPr>
-          <w:rStyle w:val="VerbatimChar"/>
-          <w:i/>
-          <w:iCs/>
-        </w:rPr>
-        <w:t xml:space="preserve">00_PASO_A_PASO.md</w:t>
-      </w:r>
-      <w:r>
-        <w:rPr>
-          <w:i/>
-          <w:iCs/>
-        </w:rPr>
-        <w:t xml:space="preserve">, sección 8); (4) comprimir junto con</w:t>
-      </w:r>
-      <w:r>
-        <w:rPr>
-          <w:i/>
-          <w:iCs/>
-        </w:rPr>
-        <w:t xml:space="preserve"> </w:t>
-      </w:r>
-      <w:r>
-        <w:rPr>
-          <w:rStyle w:val="VerbatimChar"/>
-          <w:i/>
-          <w:iCs/>
-        </w:rPr>
-        <w:t xml:space="preserve">imagenes/</w:t>
-      </w:r>
-      <w:r>
-        <w:rPr>
-          <w:i/>
-          <w:iCs/>
-        </w:rPr>
-        <w:t xml:space="preserve"> </w:t>
-      </w:r>
-      <w:r>
-        <w:rPr>
-          <w:i/>
-          <w:iCs/>
-        </w:rPr>
-        <w:t xml:space="preserve">y</w:t>
-      </w:r>
-      <w:r>
-        <w:rPr>
-          <w:i/>
-          <w:iCs/>
-        </w:rPr>
-        <w:t xml:space="preserve"> </w:t>
-      </w:r>
-      <w:r>
-        <w:rPr>
-          <w:rStyle w:val="VerbatimChar"/>
-          <w:i/>
-          <w:iCs/>
-        </w:rPr>
-        <w:t xml:space="preserve">registro_prompts.txt</w:t>
-      </w:r>
-      <w:r>
-        <w:rPr>
-          <w:i/>
-          <w:iCs/>
-        </w:rPr>
-        <w:t xml:space="preserve">.</w:t>
-      </w:r>
-    </w:p>
-    <w:bookmarkEnd w:id="45"/>
+    <w:bookmarkEnd w:id="43"/>
     <w:sectPr>
       <w:footnotePr>
         <w:numRestart w:val="eachSect"/>

</xml_diff>